<commit_message>
Update: Updated the cv with portfolio website
</commit_message>
<xml_diff>
--- a/public/cv.docx
+++ b/public/cv.docx
@@ -36,7 +36,15 @@
           <w:iCs/>
           <w:color w:val="0F7B6C"/>
         </w:rPr>
-        <w:t>Full Stack Developer  ·  Mobile Developer</w:t>
+        <w:t>Full Stack Develope</w:t>
+      </w:r>
+      <w:r>
+        <w:rPr>
+          <w:i/>
+          <w:iCs/>
+          <w:color w:val="0F7B6C"/>
+        </w:rPr>
+        <w:t>r</w:t>
       </w:r>
     </w:p>
     <w:p>
@@ -53,15 +61,7 @@
           <w:sz w:val="17"/>
           <w:szCs w:val="17"/>
         </w:rPr>
-        <w:t>Pokhara</w:t>
-      </w:r>
-      <w:r>
-        <w:rPr>
-          <w:color w:val="666666"/>
-          <w:sz w:val="17"/>
-          <w:szCs w:val="17"/>
-        </w:rPr>
-        <w:t xml:space="preserve">, Nepal  |  +977 9815167761  |  </w:t>
+        <w:t xml:space="preserve">Pokhara, Nepal  |  +977 9815167761  |  </w:t>
       </w:r>
       <w:hyperlink r:id="rId5" w:history="1">
         <w:r>
@@ -90,19 +90,8 @@
             <w:szCs w:val="17"/>
             <w:u w:val="single"/>
           </w:rPr>
-          <w:t>linkedin.com/in/</w:t>
+          <w:t>linkedin.com/in/sushant-adk</w:t>
         </w:r>
-        <w:proofErr w:type="spellStart"/>
-        <w:r>
-          <w:rPr>
-            <w:color w:val="0F7B6C"/>
-            <w:sz w:val="17"/>
-            <w:szCs w:val="17"/>
-            <w:u w:val="single"/>
-          </w:rPr>
-          <w:t>sushant-adk</w:t>
-        </w:r>
-        <w:proofErr w:type="spellEnd"/>
       </w:hyperlink>
       <w:r>
         <w:rPr>
@@ -121,6 +110,32 @@
             <w:u w:val="single"/>
           </w:rPr>
           <w:t>github.com/E-n-N-D</w:t>
+        </w:r>
+      </w:hyperlink>
+    </w:p>
+    <w:p>
+      <w:pPr>
+        <w:pBdr>
+          <w:bottom w:val="single" w:sz="18" w:space="1" w:color="auto"/>
+        </w:pBdr>
+        <w:spacing w:line="360" w:lineRule="auto"/>
+        <w:jc w:val="center"/>
+        <w:rPr>
+          <w:color w:val="0F7B6C"/>
+          <w:sz w:val="17"/>
+          <w:szCs w:val="17"/>
+          <w:u w:val="single"/>
+        </w:rPr>
+      </w:pPr>
+      <w:hyperlink r:id="rId8" w:history="1">
+        <w:r>
+          <w:rPr>
+            <w:color w:val="0F7B6C"/>
+            <w:sz w:val="17"/>
+            <w:szCs w:val="17"/>
+            <w:u w:val="single"/>
+          </w:rPr>
+          <w:t>https://sushant-adhikari.com.np</w:t>
         </w:r>
       </w:hyperlink>
     </w:p>
@@ -168,12 +183,6 @@
         <w:gridCol w:w="3600"/>
       </w:tblGrid>
       <w:tr>
-        <w:tblPrEx>
-          <w:tblCellMar>
-            <w:top w:w="0" w:type="dxa"/>
-            <w:bottom w:w="0" w:type="dxa"/>
-          </w:tblCellMar>
-        </w:tblPrEx>
         <w:tc>
           <w:tcPr>
             <w:tcW w:w="5760" w:type="dxa"/>
@@ -342,12 +351,6 @@
         <w:gridCol w:w="3600"/>
       </w:tblGrid>
       <w:tr>
-        <w:tblPrEx>
-          <w:tblCellMar>
-            <w:top w:w="0" w:type="dxa"/>
-            <w:bottom w:w="0" w:type="dxa"/>
-          </w:tblCellMar>
-        </w:tblPrEx>
         <w:tc>
           <w:tcPr>
             <w:tcW w:w="5760" w:type="dxa"/>
@@ -423,29 +426,7 @@
           <w:sz w:val="18"/>
           <w:szCs w:val="18"/>
         </w:rPr>
-        <w:t xml:space="preserve">LIS Nepal </w:t>
-      </w:r>
-      <w:proofErr w:type="spellStart"/>
-      <w:r>
-        <w:rPr>
-          <w:i/>
-          <w:iCs/>
-          <w:color w:val="0F7B6C"/>
-          <w:sz w:val="18"/>
-          <w:szCs w:val="18"/>
-        </w:rPr>
-        <w:t>Pvt.</w:t>
-      </w:r>
-      <w:proofErr w:type="spellEnd"/>
-      <w:r>
-        <w:rPr>
-          <w:i/>
-          <w:iCs/>
-          <w:color w:val="0F7B6C"/>
-          <w:sz w:val="18"/>
-          <w:szCs w:val="18"/>
-        </w:rPr>
-        <w:t xml:space="preserve"> Ltd. · Lalitpur</w:t>
+        <w:t>LIS Nepal Pvt. Ltd. · Lalitpur</w:t>
       </w:r>
     </w:p>
     <w:p>
@@ -496,23 +477,7 @@
           <w:sz w:val="19"/>
           <w:szCs w:val="19"/>
         </w:rPr>
-        <w:t xml:space="preserve">Operated within Agile (Scrum) delivery cycle; managed tasks via </w:t>
-      </w:r>
-      <w:proofErr w:type="spellStart"/>
-      <w:r>
-        <w:rPr>
-          <w:sz w:val="19"/>
-          <w:szCs w:val="19"/>
-        </w:rPr>
-        <w:t>ClickUp</w:t>
-      </w:r>
-      <w:proofErr w:type="spellEnd"/>
-      <w:r>
-        <w:rPr>
-          <w:sz w:val="19"/>
-          <w:szCs w:val="19"/>
-        </w:rPr>
-        <w:t>.</w:t>
+        <w:t>Operated within Agile (Scrum) delivery cycle; managed tasks via ClickUp.</w:t>
       </w:r>
     </w:p>
     <w:tbl>
@@ -537,12 +502,6 @@
         <w:gridCol w:w="3600"/>
       </w:tblGrid>
       <w:tr>
-        <w:tblPrEx>
-          <w:tblCellMar>
-            <w:top w:w="0" w:type="dxa"/>
-            <w:bottom w:w="0" w:type="dxa"/>
-          </w:tblCellMar>
-        </w:tblPrEx>
         <w:tc>
           <w:tcPr>
             <w:tcW w:w="5760" w:type="dxa"/>
@@ -675,6 +634,10 @@
     <w:p>
       <w:pPr>
         <w:spacing w:before="80"/>
+        <w:rPr>
+          <w:sz w:val="12"/>
+          <w:szCs w:val="12"/>
+        </w:rPr>
       </w:pPr>
     </w:p>
     <w:p>
@@ -731,46 +694,6 @@
           <w:szCs w:val="19"/>
         </w:rPr>
         <w:t xml:space="preserve">Service-based referral platform connecting users with verified professionals (migration, legal, real estate). Built with React, Node.js, Express, Prisma, and PostgreSQL.  </w:t>
-      </w:r>
-      <w:hyperlink r:id="rId8" w:history="1">
-        <w:r>
-          <w:rPr>
-            <w:color w:val="0F7B6C"/>
-            <w:sz w:val="19"/>
-            <w:szCs w:val="19"/>
-            <w:u w:val="single"/>
-          </w:rPr>
-          <w:t>↗</w:t>
-        </w:r>
-      </w:hyperlink>
-    </w:p>
-    <w:p>
-      <w:pPr>
-        <w:spacing w:before="30" w:after="30"/>
-      </w:pPr>
-      <w:r>
-        <w:rPr>
-          <w:b/>
-          <w:bCs/>
-          <w:color w:val="0F7B6C"/>
-        </w:rPr>
-        <w:t xml:space="preserve">• </w:t>
-      </w:r>
-      <w:r>
-        <w:rPr>
-          <w:b/>
-          <w:bCs/>
-          <w:sz w:val="19"/>
-          <w:szCs w:val="19"/>
-        </w:rPr>
-        <w:t xml:space="preserve">2feat — Affiliate Marketing — </w:t>
-      </w:r>
-      <w:r>
-        <w:rPr>
-          <w:sz w:val="19"/>
-          <w:szCs w:val="19"/>
-        </w:rPr>
-        <w:t xml:space="preserve">Sneakers &amp; clothing platform with brand news, trending products, and image sliders. Full-stack: React, Node.js, MongoDB.  </w:t>
       </w:r>
       <w:hyperlink r:id="rId9" w:history="1">
         <w:r>
@@ -796,7 +719,6 @@
         </w:rPr>
         <w:t xml:space="preserve">• </w:t>
       </w:r>
-      <w:proofErr w:type="spellStart"/>
       <w:r>
         <w:rPr>
           <w:b/>
@@ -804,24 +726,14 @@
           <w:sz w:val="19"/>
           <w:szCs w:val="19"/>
         </w:rPr>
-        <w:t>Aveksha</w:t>
-      </w:r>
-      <w:proofErr w:type="spellEnd"/>
-      <w:r>
-        <w:rPr>
-          <w:b/>
-          <w:bCs/>
+        <w:t xml:space="preserve">2feat — Affiliate Marketing — </w:t>
+      </w:r>
+      <w:r>
+        <w:rPr>
           <w:sz w:val="19"/>
           <w:szCs w:val="19"/>
         </w:rPr>
-        <w:t xml:space="preserve"> — Digital Healthcare App — </w:t>
-      </w:r>
-      <w:r>
-        <w:rPr>
-          <w:sz w:val="19"/>
-          <w:szCs w:val="19"/>
-        </w:rPr>
-        <w:t xml:space="preserve">Flutter/Firebase mobile app for booking healthcare appointments and organising medical records. Node.js/MongoDB backend.  </w:t>
+        <w:t xml:space="preserve">Sneakers &amp; clothing platform with brand news, trending products, and image sliders. Full-stack: React, Node.js, MongoDB.  </w:t>
       </w:r>
       <w:hyperlink r:id="rId10" w:history="1">
         <w:r>
@@ -847,7 +759,6 @@
         </w:rPr>
         <w:t xml:space="preserve">• </w:t>
       </w:r>
-      <w:proofErr w:type="spellStart"/>
       <w:r>
         <w:rPr>
           <w:b/>
@@ -855,24 +766,14 @@
           <w:sz w:val="19"/>
           <w:szCs w:val="19"/>
         </w:rPr>
-        <w:t>Insighter</w:t>
-      </w:r>
-      <w:proofErr w:type="spellEnd"/>
-      <w:r>
-        <w:rPr>
-          <w:b/>
-          <w:bCs/>
+        <w:t xml:space="preserve">Aveksha — Digital Healthcare App — </w:t>
+      </w:r>
+      <w:r>
+        <w:rPr>
           <w:sz w:val="19"/>
           <w:szCs w:val="19"/>
         </w:rPr>
-        <w:t xml:space="preserve"> — Learning Management System — </w:t>
-      </w:r>
-      <w:r>
-        <w:rPr>
-          <w:sz w:val="19"/>
-          <w:szCs w:val="19"/>
-        </w:rPr>
-        <w:t xml:space="preserve">Gamified school LMS built with Flutter, Firebase, Node.js, and MongoDB.  </w:t>
+        <w:t xml:space="preserve">Flutter/Firebase mobile app for booking healthcare appointments and organising medical records. Node.js/MongoDB backend.  </w:t>
       </w:r>
       <w:hyperlink r:id="rId11" w:history="1">
         <w:r>
@@ -905,14 +806,14 @@
           <w:sz w:val="19"/>
           <w:szCs w:val="19"/>
         </w:rPr>
-        <w:t xml:space="preserve">Pharma App — </w:t>
+        <w:t xml:space="preserve">Insighter — Learning Management System — </w:t>
       </w:r>
       <w:r>
         <w:rPr>
           <w:sz w:val="19"/>
           <w:szCs w:val="19"/>
         </w:rPr>
-        <w:t xml:space="preserve">Web-based pharmacy inventory manager with stock tracking and medicine expiry monitoring (React, Node.js, MongoDB).  </w:t>
+        <w:t xml:space="preserve">Gamified school LMS built with Flutter, Firebase, Node.js, and MongoDB.  </w:t>
       </w:r>
       <w:hyperlink r:id="rId12" w:history="1">
         <w:r>
@@ -928,7 +829,51 @@
     </w:p>
     <w:p>
       <w:pPr>
+        <w:spacing w:before="30" w:after="30"/>
+      </w:pPr>
+      <w:r>
+        <w:rPr>
+          <w:b/>
+          <w:bCs/>
+          <w:color w:val="0F7B6C"/>
+        </w:rPr>
+        <w:t xml:space="preserve">• </w:t>
+      </w:r>
+      <w:r>
+        <w:rPr>
+          <w:b/>
+          <w:bCs/>
+          <w:sz w:val="19"/>
+          <w:szCs w:val="19"/>
+        </w:rPr>
+        <w:t xml:space="preserve">Pharma App — </w:t>
+      </w:r>
+      <w:r>
+        <w:rPr>
+          <w:sz w:val="19"/>
+          <w:szCs w:val="19"/>
+        </w:rPr>
+        <w:t xml:space="preserve">Web-based pharmacy inventory manager with stock tracking and medicine expiry monitoring (React, Node.js, MongoDB).  </w:t>
+      </w:r>
+      <w:hyperlink r:id="rId13" w:history="1">
+        <w:r>
+          <w:rPr>
+            <w:color w:val="0F7B6C"/>
+            <w:sz w:val="19"/>
+            <w:szCs w:val="19"/>
+            <w:u w:val="single"/>
+          </w:rPr>
+          <w:t>↗</w:t>
+        </w:r>
+      </w:hyperlink>
+    </w:p>
+    <w:p>
+      <w:pPr>
         <w:spacing w:before="80"/>
+        <w:rPr>
+          <w:sz w:val="12"/>
+          <w:szCs w:val="12"/>
+        </w:rPr>
       </w:pPr>
     </w:p>
     <w:p>
@@ -980,12 +925,6 @@
         <w:gridCol w:w="7200"/>
       </w:tblGrid>
       <w:tr>
-        <w:tblPrEx>
-          <w:tblCellMar>
-            <w:top w:w="0" w:type="dxa"/>
-            <w:bottom w:w="0" w:type="dxa"/>
-          </w:tblCellMar>
-        </w:tblPrEx>
         <w:tc>
           <w:tcPr>
             <w:tcW w:w="2160" w:type="dxa"/>
@@ -1049,12 +988,6 @@
         </w:tc>
       </w:tr>
       <w:tr>
-        <w:tblPrEx>
-          <w:tblCellMar>
-            <w:top w:w="0" w:type="dxa"/>
-            <w:bottom w:w="0" w:type="dxa"/>
-          </w:tblCellMar>
-        </w:tblPrEx>
         <w:tc>
           <w:tcPr>
             <w:tcW w:w="2160" w:type="dxa"/>
@@ -1112,34 +1045,12 @@
                 <w:sz w:val="19"/>
                 <w:szCs w:val="19"/>
               </w:rPr>
-              <w:t xml:space="preserve">Node.js · </w:t>
-            </w:r>
-            <w:proofErr w:type="spellStart"/>
-            <w:r>
-              <w:rPr>
-                <w:sz w:val="19"/>
-                <w:szCs w:val="19"/>
-              </w:rPr>
-              <w:t>NestJS</w:t>
-            </w:r>
-            <w:proofErr w:type="spellEnd"/>
-            <w:r>
-              <w:rPr>
-                <w:sz w:val="19"/>
-                <w:szCs w:val="19"/>
-              </w:rPr>
-              <w:t xml:space="preserve"> · Django · Express · Python · REST API</w:t>
+              <w:t>Node.js · NestJS · Django · Express · Python · REST API</w:t>
             </w:r>
           </w:p>
         </w:tc>
       </w:tr>
       <w:tr>
-        <w:tblPrEx>
-          <w:tblCellMar>
-            <w:top w:w="0" w:type="dxa"/>
-            <w:bottom w:w="0" w:type="dxa"/>
-          </w:tblCellMar>
-        </w:tblPrEx>
         <w:tc>
           <w:tcPr>
             <w:tcW w:w="2160" w:type="dxa"/>
@@ -1203,12 +1114,6 @@
         </w:tc>
       </w:tr>
       <w:tr>
-        <w:tblPrEx>
-          <w:tblCellMar>
-            <w:top w:w="0" w:type="dxa"/>
-            <w:bottom w:w="0" w:type="dxa"/>
-          </w:tblCellMar>
-        </w:tblPrEx>
         <w:tc>
           <w:tcPr>
             <w:tcW w:w="2160" w:type="dxa"/>
@@ -1272,12 +1177,6 @@
         </w:tc>
       </w:tr>
       <w:tr>
-        <w:tblPrEx>
-          <w:tblCellMar>
-            <w:top w:w="0" w:type="dxa"/>
-            <w:bottom w:w="0" w:type="dxa"/>
-          </w:tblCellMar>
-        </w:tblPrEx>
         <w:tc>
           <w:tcPr>
             <w:tcW w:w="2160" w:type="dxa"/>
@@ -1341,12 +1240,6 @@
         </w:tc>
       </w:tr>
       <w:tr>
-        <w:tblPrEx>
-          <w:tblCellMar>
-            <w:top w:w="0" w:type="dxa"/>
-            <w:bottom w:w="0" w:type="dxa"/>
-          </w:tblCellMar>
-        </w:tblPrEx>
         <w:tc>
           <w:tcPr>
             <w:tcW w:w="2160" w:type="dxa"/>
@@ -1413,6 +1306,10 @@
     <w:p>
       <w:pPr>
         <w:spacing w:before="80"/>
+        <w:rPr>
+          <w:sz w:val="12"/>
+          <w:szCs w:val="12"/>
+        </w:rPr>
       </w:pPr>
     </w:p>
     <w:p>
@@ -1464,12 +1361,6 @@
         <w:gridCol w:w="3600"/>
       </w:tblGrid>
       <w:tr>
-        <w:tblPrEx>
-          <w:tblCellMar>
-            <w:top w:w="0" w:type="dxa"/>
-            <w:bottom w:w="0" w:type="dxa"/>
-          </w:tblCellMar>
-        </w:tblPrEx>
         <w:tc>
           <w:tcPr>
             <w:tcW w:w="5760" w:type="dxa"/>
@@ -1570,12 +1461,6 @@
         <w:gridCol w:w="2981"/>
       </w:tblGrid>
       <w:tr>
-        <w:tblPrEx>
-          <w:tblCellMar>
-            <w:top w:w="0" w:type="dxa"/>
-            <w:bottom w:w="0" w:type="dxa"/>
-          </w:tblCellMar>
-        </w:tblPrEx>
         <w:tc>
           <w:tcPr>
             <w:tcW w:w="6379" w:type="dxa"/>
@@ -1657,6 +1542,10 @@
     <w:p>
       <w:pPr>
         <w:spacing w:before="80"/>
+        <w:rPr>
+          <w:sz w:val="12"/>
+          <w:szCs w:val="12"/>
+        </w:rPr>
       </w:pPr>
     </w:p>
     <w:p>
@@ -1735,27 +1624,7 @@
           <w:sz w:val="19"/>
           <w:szCs w:val="19"/>
         </w:rPr>
-        <w:t xml:space="preserve">2nd Place — </w:t>
-      </w:r>
-      <w:proofErr w:type="spellStart"/>
-      <w:r>
-        <w:rPr>
-          <w:b/>
-          <w:bCs/>
-          <w:sz w:val="19"/>
-          <w:szCs w:val="19"/>
-        </w:rPr>
-        <w:t>KUHackfest</w:t>
-      </w:r>
-      <w:proofErr w:type="spellEnd"/>
-      <w:r>
-        <w:rPr>
-          <w:b/>
-          <w:bCs/>
-          <w:sz w:val="19"/>
-          <w:szCs w:val="19"/>
-        </w:rPr>
-        <w:t xml:space="preserve"> 2022</w:t>
+        <w:t>2nd Place — KUHackfest 2022</w:t>
       </w:r>
       <w:r>
         <w:rPr>
@@ -2558,6 +2427,18 @@
       <w:szCs w:val="20"/>
     </w:rPr>
   </w:style>
+  <w:style w:type="character" w:styleId="UnresolvedMention">
+    <w:name w:val="Unresolved Mention"/>
+    <w:basedOn w:val="DefaultParagraphFont"/>
+    <w:uiPriority w:val="99"/>
+    <w:semiHidden/>
+    <w:unhideWhenUsed/>
+    <w:rsid w:val="00EE3022"/>
+    <w:rPr>
+      <w:color w:val="605E5C"/>
+      <w:shd w:val="clear" w:color="auto" w:fill="E1DFDD"/>
+    </w:rPr>
+  </w:style>
 </w:styles>
 </file>
 

</xml_diff>

<commit_message>
Update: Changes to the CV
</commit_message>
<xml_diff>
--- a/public/cv.docx
+++ b/public/cv.docx
@@ -1,6 +1,6 @@
 
 <file path=word/document.xml><?xml version="1.0" encoding="utf-8"?>
-<w:document xmlns:wpc="http://schemas.microsoft.com/office/word/2010/wordprocessingCanvas" xmlns:cx="http://schemas.microsoft.com/office/drawing/2014/chartex" xmlns:cx1="http://schemas.microsoft.com/office/drawing/2015/9/8/chartex" xmlns:cx2="http://schemas.microsoft.com/office/drawing/2015/10/21/chartex" xmlns:cx3="http://schemas.microsoft.com/office/drawing/2016/5/9/chartex" xmlns:cx4="http://schemas.microsoft.com/office/drawing/2016/5/10/chartex" xmlns:cx5="http://schemas.microsoft.com/office/drawing/2016/5/11/chartex" xmlns:cx6="http://schemas.microsoft.com/office/drawing/2016/5/12/chartex" xmlns:cx7="http://schemas.microsoft.com/office/drawing/2016/5/13/chartex" xmlns:cx8="http://schemas.microsoft.com/office/drawing/2016/5/14/chartex" xmlns:mc="http://schemas.openxmlformats.org/markup-compatibility/2006" xmlns:aink="http://schemas.microsoft.com/office/drawing/2016/ink" xmlns:am3d="http://schemas.microsoft.com/office/drawing/2017/model3d" xmlns:o="urn:schemas-microsoft-com:office:office" xmlns:oel="http://schemas.microsoft.com/office/2019/extlst" xmlns:r="http://schemas.openxmlformats.org/officeDocument/2006/relationships" xmlns:m="http://schemas.openxmlformats.org/officeDocument/2006/math" xmlns:v="urn:schemas-microsoft-com:vml" xmlns:wp14="http://schemas.microsoft.com/office/word/2010/wordprocessingDrawing" xmlns:wp="http://schemas.openxmlformats.org/drawingml/2006/wordprocessingDrawing" xmlns:w10="urn:schemas-microsoft-com:office:word" xmlns:w="http://schemas.openxmlformats.org/wordprocessingml/2006/main" xmlns:w14="http://schemas.microsoft.com/office/word/2010/wordml" xmlns:w15="http://schemas.microsoft.com/office/word/2012/wordml" xmlns:w16cex="http://schemas.microsoft.com/office/word/2018/wordml/cex" xmlns:w16cid="http://schemas.microsoft.com/office/word/2016/wordml/cid" xmlns:w16="http://schemas.microsoft.com/office/word/2018/wordml" xmlns:w16du="http://schemas.microsoft.com/office/word/2023/wordml/word16du" xmlns:w16sdtdh="http://schemas.microsoft.com/office/word/2020/wordml/sdtdatahash" xmlns:w16sdtfl="http://schemas.microsoft.com/office/word/2024/wordml/sdtformatlock" xmlns:w16se="http://schemas.microsoft.com/office/word/2015/wordml/symex" xmlns:wpg="http://schemas.microsoft.com/office/word/2010/wordprocessingGroup" xmlns:wpi="http://schemas.microsoft.com/office/word/2010/wordprocessingInk" xmlns:wne="http://schemas.microsoft.com/office/word/2006/wordml" xmlns:wps="http://schemas.microsoft.com/office/word/2010/wordprocessingShape" mc:Ignorable="w14 w15 w16se w16cid w16 w16cex w16sdtdh w16sdtfl w16du wp14">
+<w:document xmlns:wpc="http://schemas.microsoft.com/office/word/2010/wordprocessingCanvas" xmlns:cx="http://schemas.microsoft.com/office/drawing/2014/chartex" xmlns:cx1="http://schemas.microsoft.com/office/drawing/2015/9/8/chartex" xmlns:cx2="http://schemas.microsoft.com/office/drawing/2015/10/21/chartex" xmlns:cx3="http://schemas.microsoft.com/office/drawing/2016/5/9/chartex" xmlns:cx4="http://schemas.microsoft.com/office/drawing/2016/5/10/chartex" xmlns:cx5="http://schemas.microsoft.com/office/drawing/2016/5/11/chartex" xmlns:cx6="http://schemas.microsoft.com/office/drawing/2016/5/12/chartex" xmlns:cx7="http://schemas.microsoft.com/office/drawing/2016/5/13/chartex" xmlns:cx8="http://schemas.microsoft.com/office/drawing/2016/5/14/chartex" xmlns:mc="http://schemas.openxmlformats.org/markup-compatibility/2006" xmlns:aink="http://schemas.microsoft.com/office/drawing/2016/ink" xmlns:am3d="http://schemas.microsoft.com/office/drawing/2017/model3d" xmlns:o="urn:schemas-microsoft-com:office:office" xmlns:oel="http://schemas.microsoft.com/office/2019/extlst" xmlns:r="http://schemas.openxmlformats.org/officeDocument/2006/relationships" xmlns:m="http://schemas.openxmlformats.org/officeDocument/2006/math" xmlns:v="urn:schemas-microsoft-com:vml" xmlns:wp14="http://schemas.microsoft.com/office/word/2010/wordprocessingDrawing" xmlns:wp="http://schemas.openxmlformats.org/drawingml/2006/wordprocessingDrawing" xmlns:w10="urn:schemas-microsoft-com:office:word" xmlns:w="http://schemas.openxmlformats.org/wordprocessingml/2006/main" xmlns:w14="http://schemas.microsoft.com/office/word/2010/wordml" xmlns:w15="http://schemas.microsoft.com/office/word/2012/wordml" xmlns:w16cei="http://schemas.microsoft.com/office/word/2026/wordml/cei" xmlns:w16cex="http://schemas.microsoft.com/office/word/2018/wordml/cex" xmlns:w16cid="http://schemas.microsoft.com/office/word/2016/wordml/cid" xmlns:w16="http://schemas.microsoft.com/office/word/2018/wordml" xmlns:w16du="http://schemas.microsoft.com/office/word/2023/wordml/word16du" xmlns:w16sdtdh="http://schemas.microsoft.com/office/word/2020/wordml/sdtdatahash" xmlns:w16sdtfl="http://schemas.microsoft.com/office/word/2024/wordml/sdtformatlock" xmlns:w16se="http://schemas.microsoft.com/office/word/2015/wordml/symex" xmlns:wpg="http://schemas.microsoft.com/office/word/2010/wordprocessingGroup" xmlns:wpi="http://schemas.microsoft.com/office/word/2010/wordprocessingInk" xmlns:wne="http://schemas.microsoft.com/office/word/2006/wordml" xmlns:wps="http://schemas.microsoft.com/office/word/2010/wordprocessingShape" mc:Ignorable="w14 w15 w16se w16cid w16 w16cex w16sdtdh w16sdtfl w16du wp14">
   <w:body>
     <w:p>
       <w:pPr>
@@ -29,12 +29,15 @@
         </w:pBdr>
         <w:spacing w:after="80"/>
         <w:jc w:val="center"/>
+        <w:rPr>
+          <w:color w:val="auto"/>
+        </w:rPr>
       </w:pPr>
       <w:r>
         <w:rPr>
           <w:i/>
           <w:iCs/>
-          <w:color w:val="0F7B6C"/>
+          <w:color w:val="auto"/>
         </w:rPr>
         <w:t>Full Stack Develope</w:t>
       </w:r>
@@ -42,7 +45,7 @@
         <w:rPr>
           <w:i/>
           <w:iCs/>
-          <w:color w:val="0F7B6C"/>
+          <w:color w:val="auto"/>
         </w:rPr>
         <w:t>r</w:t>
       </w:r>
@@ -54,6 +57,9 @@
         </w:pBdr>
         <w:spacing w:line="360" w:lineRule="auto"/>
         <w:jc w:val="center"/>
+        <w:rPr>
+          <w:color w:val="auto"/>
+        </w:rPr>
       </w:pPr>
       <w:r>
         <w:rPr>
@@ -61,12 +67,30 @@
           <w:sz w:val="17"/>
           <w:szCs w:val="17"/>
         </w:rPr>
-        <w:t xml:space="preserve">Pokhara, Nepal  |  +977 9815167761  |  </w:t>
+        <w:t xml:space="preserve">+977 </w:t>
+      </w:r>
+      <w:proofErr w:type="gramStart"/>
+      <w:r>
+        <w:rPr>
+          <w:color w:val="666666"/>
+          <w:sz w:val="17"/>
+          <w:szCs w:val="17"/>
+        </w:rPr>
+        <w:t>9815167761  |</w:t>
+      </w:r>
+      <w:proofErr w:type="gramEnd"/>
+      <w:r>
+        <w:rPr>
+          <w:color w:val="666666"/>
+          <w:sz w:val="17"/>
+          <w:szCs w:val="17"/>
+        </w:rPr>
+        <w:t xml:space="preserve">  </w:t>
       </w:r>
       <w:hyperlink r:id="rId5" w:history="1">
         <w:r>
           <w:rPr>
-            <w:color w:val="0F7B6C"/>
+            <w:color w:val="auto"/>
             <w:sz w:val="17"/>
             <w:szCs w:val="17"/>
             <w:u w:val="single"/>
@@ -76,7 +100,7 @@
       </w:hyperlink>
       <w:r>
         <w:rPr>
-          <w:color w:val="666666"/>
+          <w:color w:val="auto"/>
           <w:sz w:val="17"/>
           <w:szCs w:val="17"/>
         </w:rPr>
@@ -85,17 +109,28 @@
       <w:hyperlink r:id="rId6" w:history="1">
         <w:r>
           <w:rPr>
-            <w:color w:val="0F7B6C"/>
+            <w:color w:val="auto"/>
             <w:sz w:val="17"/>
             <w:szCs w:val="17"/>
             <w:u w:val="single"/>
           </w:rPr>
-          <w:t>linkedin.com/in/sushant-adk</w:t>
+          <w:t>linkedin.com/in/</w:t>
         </w:r>
+        <w:proofErr w:type="spellStart"/>
+        <w:r>
+          <w:rPr>
+            <w:color w:val="auto"/>
+            <w:sz w:val="17"/>
+            <w:szCs w:val="17"/>
+            <w:u w:val="single"/>
+          </w:rPr>
+          <w:t>sushant-adk</w:t>
+        </w:r>
+        <w:proofErr w:type="spellEnd"/>
       </w:hyperlink>
       <w:r>
         <w:rPr>
-          <w:color w:val="666666"/>
+          <w:color w:val="auto"/>
           <w:sz w:val="17"/>
           <w:szCs w:val="17"/>
         </w:rPr>
@@ -104,7 +139,7 @@
       <w:hyperlink r:id="rId7" w:history="1">
         <w:r>
           <w:rPr>
-            <w:color w:val="0F7B6C"/>
+            <w:color w:val="auto"/>
             <w:sz w:val="17"/>
             <w:szCs w:val="17"/>
             <w:u w:val="single"/>
@@ -121,7 +156,7 @@
         <w:spacing w:line="360" w:lineRule="auto"/>
         <w:jc w:val="center"/>
         <w:rPr>
-          <w:color w:val="0F7B6C"/>
+          <w:color w:val="auto"/>
           <w:sz w:val="17"/>
           <w:szCs w:val="17"/>
           <w:u w:val="single"/>
@@ -130,7 +165,7 @@
       <w:hyperlink r:id="rId8" w:history="1">
         <w:r>
           <w:rPr>
-            <w:color w:val="0F7B6C"/>
+            <w:color w:val="auto"/>
             <w:sz w:val="17"/>
             <w:szCs w:val="17"/>
             <w:u w:val="single"/>
@@ -142,7 +177,7 @@
     <w:p>
       <w:pPr>
         <w:pBdr>
-          <w:bottom w:val="single" w:sz="8" w:space="1" w:color="3A7C22" w:themeColor="accent6" w:themeShade="BF"/>
+          <w:bottom w:val="single" w:sz="8" w:space="1" w:color="156082" w:themeColor="accent1"/>
         </w:pBdr>
         <w:spacing w:before="160" w:line="360" w:lineRule="auto"/>
         <w:rPr>
@@ -249,12 +284,15 @@
     <w:p>
       <w:pPr>
         <w:spacing w:after="30"/>
+        <w:rPr>
+          <w:color w:val="156082" w:themeColor="accent1"/>
+        </w:rPr>
       </w:pPr>
       <w:r>
         <w:rPr>
           <w:i/>
           <w:iCs/>
-          <w:color w:val="0F7B6C"/>
+          <w:color w:val="156082" w:themeColor="accent1"/>
           <w:sz w:val="18"/>
           <w:szCs w:val="18"/>
         </w:rPr>
@@ -417,16 +455,45 @@
     <w:p>
       <w:pPr>
         <w:spacing w:after="30"/>
-      </w:pPr>
-      <w:r>
         <w:rPr>
           <w:i/>
           <w:iCs/>
-          <w:color w:val="0F7B6C"/>
+          <w:color w:val="156082" w:themeColor="accent1"/>
           <w:sz w:val="18"/>
           <w:szCs w:val="18"/>
         </w:rPr>
-        <w:t>LIS Nepal Pvt. Ltd. · Lalitpur</w:t>
+      </w:pPr>
+      <w:r>
+        <w:rPr>
+          <w:i/>
+          <w:iCs/>
+          <w:color w:val="156082" w:themeColor="accent1"/>
+          <w:sz w:val="18"/>
+          <w:szCs w:val="18"/>
+        </w:rPr>
+        <w:t xml:space="preserve">LIS Nepal </w:t>
+      </w:r>
+      <w:proofErr w:type="spellStart"/>
+      <w:r>
+        <w:rPr>
+          <w:i/>
+          <w:iCs/>
+          <w:color w:val="156082" w:themeColor="accent1"/>
+          <w:sz w:val="18"/>
+          <w:szCs w:val="18"/>
+        </w:rPr>
+        <w:t>Pvt.</w:t>
+      </w:r>
+      <w:proofErr w:type="spellEnd"/>
+      <w:r>
+        <w:rPr>
+          <w:i/>
+          <w:iCs/>
+          <w:color w:val="156082" w:themeColor="accent1"/>
+          <w:sz w:val="18"/>
+          <w:szCs w:val="18"/>
+        </w:rPr>
+        <w:t xml:space="preserve"> Ltd. · Lalitpur</w:t>
       </w:r>
     </w:p>
     <w:p>
@@ -477,7 +544,23 @@
           <w:sz w:val="19"/>
           <w:szCs w:val="19"/>
         </w:rPr>
-        <w:t>Operated within Agile (Scrum) delivery cycle; managed tasks via ClickUp.</w:t>
+        <w:t xml:space="preserve">Operated within Agile (Scrum) delivery cycle; managed tasks via </w:t>
+      </w:r>
+      <w:proofErr w:type="spellStart"/>
+      <w:r>
+        <w:rPr>
+          <w:sz w:val="19"/>
+          <w:szCs w:val="19"/>
+        </w:rPr>
+        <w:t>ClickUp</w:t>
+      </w:r>
+      <w:proofErr w:type="spellEnd"/>
+      <w:r>
+        <w:rPr>
+          <w:sz w:val="19"/>
+          <w:szCs w:val="19"/>
+        </w:rPr>
+        <w:t>.</w:t>
       </w:r>
     </w:p>
     <w:tbl>
@@ -568,12 +651,19 @@
     <w:p>
       <w:pPr>
         <w:spacing w:after="30"/>
-      </w:pPr>
-      <w:r>
         <w:rPr>
           <w:i/>
           <w:iCs/>
-          <w:color w:val="0F7B6C"/>
+          <w:color w:val="156082" w:themeColor="accent1"/>
+          <w:sz w:val="18"/>
+          <w:szCs w:val="18"/>
+        </w:rPr>
+      </w:pPr>
+      <w:r>
+        <w:rPr>
+          <w:i/>
+          <w:iCs/>
+          <w:color w:val="156082" w:themeColor="accent1"/>
           <w:sz w:val="18"/>
           <w:szCs w:val="18"/>
         </w:rPr>
@@ -643,7 +733,7 @@
     <w:p>
       <w:pPr>
         <w:pBdr>
-          <w:bottom w:val="single" w:sz="8" w:space="1" w:color="3A7C22" w:themeColor="accent6" w:themeShade="BF"/>
+          <w:bottom w:val="single" w:sz="8" w:space="1" w:color="156082" w:themeColor="accent1"/>
         </w:pBdr>
         <w:spacing w:before="160" w:line="360" w:lineRule="auto"/>
         <w:rPr>
@@ -675,37 +765,82 @@
         <w:rPr>
           <w:b/>
           <w:bCs/>
+          <w:color w:val="156082" w:themeColor="accent1"/>
+        </w:rPr>
+        <w:t>•</w:t>
+      </w:r>
+      <w:r>
+        <w:rPr>
+          <w:b/>
+          <w:bCs/>
           <w:color w:val="0F7B6C"/>
         </w:rPr>
-        <w:t xml:space="preserve">• </w:t>
-      </w:r>
-      <w:r>
-        <w:rPr>
-          <w:b/>
-          <w:bCs/>
-          <w:sz w:val="19"/>
-          <w:szCs w:val="19"/>
-        </w:rPr>
-        <w:t xml:space="preserve">RP Creator Group — </w:t>
-      </w:r>
-      <w:r>
-        <w:rPr>
-          <w:sz w:val="19"/>
-          <w:szCs w:val="19"/>
-        </w:rPr>
-        <w:t xml:space="preserve">Service-based referral platform connecting users with verified professionals (migration, legal, real estate). Built with React, Node.js, Express, Prisma, and PostgreSQL.  </w:t>
+        <w:t xml:space="preserve"> </w:t>
       </w:r>
       <w:hyperlink r:id="rId9" w:history="1">
         <w:r>
           <w:rPr>
-            <w:color w:val="0F7B6C"/>
+            <w:rStyle w:val="Hyperlink"/>
+            <w:b/>
+            <w:bCs/>
+            <w:color w:val="215E99" w:themeColor="text2" w:themeTint="BF"/>
             <w:sz w:val="19"/>
             <w:szCs w:val="19"/>
-            <w:u w:val="single"/>
+            <w:u w:val="none"/>
           </w:rPr>
-          <w:t>↗</w:t>
+          <w:t>RP Creator Group</w:t>
         </w:r>
       </w:hyperlink>
+      <w:r>
+        <w:rPr>
+          <w:b/>
+          <w:bCs/>
+          <w:color w:val="215E99" w:themeColor="text2" w:themeTint="BF"/>
+          <w:sz w:val="19"/>
+          <w:szCs w:val="19"/>
+        </w:rPr>
+        <w:t xml:space="preserve"> </w:t>
+      </w:r>
+      <w:r>
+        <w:rPr>
+          <w:b/>
+          <w:bCs/>
+          <w:color w:val="215E99" w:themeColor="text2" w:themeTint="BF"/>
+          <w:sz w:val="19"/>
+          <w:szCs w:val="19"/>
+        </w:rPr>
+        <w:t>:</w:t>
+      </w:r>
+      <w:r>
+        <w:rPr>
+          <w:b/>
+          <w:bCs/>
+          <w:sz w:val="19"/>
+          <w:szCs w:val="19"/>
+        </w:rPr>
+        <w:t xml:space="preserve"> </w:t>
+      </w:r>
+      <w:r>
+        <w:rPr>
+          <w:sz w:val="19"/>
+          <w:szCs w:val="19"/>
+        </w:rPr>
+        <w:t>Service-based referral platform connecting users with verified professionals (migration, legal, real estate). Built with React,</w:t>
+      </w:r>
+      <w:r>
+        <w:rPr>
+          <w:sz w:val="19"/>
+          <w:szCs w:val="19"/>
+        </w:rPr>
+        <w:t xml:space="preserve"> Flutter,</w:t>
+      </w:r>
+      <w:r>
+        <w:rPr>
+          <w:sz w:val="19"/>
+          <w:szCs w:val="19"/>
+        </w:rPr>
+        <w:t xml:space="preserve"> Node.js, Express, Prisma, and PostgreSQL.</w:t>
+      </w:r>
     </w:p>
     <w:p>
       <w:pPr>
@@ -715,37 +850,82 @@
         <w:rPr>
           <w:b/>
           <w:bCs/>
+          <w:color w:val="156082" w:themeColor="accent1"/>
+        </w:rPr>
+        <w:t>•</w:t>
+      </w:r>
+      <w:r>
+        <w:rPr>
+          <w:b/>
+          <w:bCs/>
           <w:color w:val="0F7B6C"/>
         </w:rPr>
-        <w:t xml:space="preserve">• </w:t>
-      </w:r>
-      <w:r>
-        <w:rPr>
-          <w:b/>
-          <w:bCs/>
-          <w:sz w:val="19"/>
-          <w:szCs w:val="19"/>
-        </w:rPr>
-        <w:t xml:space="preserve">2feat — Affiliate Marketing — </w:t>
-      </w:r>
-      <w:r>
-        <w:rPr>
-          <w:sz w:val="19"/>
-          <w:szCs w:val="19"/>
-        </w:rPr>
-        <w:t xml:space="preserve">Sneakers &amp; clothing platform with brand news, trending products, and image sliders. Full-stack: React, Node.js, MongoDB.  </w:t>
+        <w:t xml:space="preserve"> </w:t>
       </w:r>
       <w:hyperlink r:id="rId10" w:history="1">
         <w:r>
           <w:rPr>
-            <w:color w:val="0F7B6C"/>
+            <w:rStyle w:val="Hyperlink"/>
+            <w:b/>
+            <w:bCs/>
+            <w:color w:val="215E99" w:themeColor="text2" w:themeTint="BF"/>
             <w:sz w:val="19"/>
             <w:szCs w:val="19"/>
-            <w:u w:val="single"/>
+            <w:u w:val="none"/>
           </w:rPr>
-          <w:t>↗</w:t>
+          <w:t>2feat (Affiliate Marketing)</w:t>
         </w:r>
       </w:hyperlink>
+      <w:r>
+        <w:rPr>
+          <w:rStyle w:val="Hyperlink"/>
+          <w:color w:val="215E99" w:themeColor="text2" w:themeTint="BF"/>
+          <w:u w:val="none"/>
+        </w:rPr>
+        <w:t xml:space="preserve"> </w:t>
+      </w:r>
+      <w:r>
+        <w:rPr>
+          <w:rStyle w:val="Hyperlink"/>
+          <w:b/>
+          <w:bCs/>
+          <w:color w:val="215E99" w:themeColor="text2" w:themeTint="BF"/>
+          <w:u w:val="none"/>
+        </w:rPr>
+        <w:t>:</w:t>
+      </w:r>
+      <w:r>
+        <w:rPr>
+          <w:b/>
+          <w:bCs/>
+          <w:sz w:val="19"/>
+          <w:szCs w:val="19"/>
+        </w:rPr>
+        <w:t xml:space="preserve"> </w:t>
+      </w:r>
+      <w:r>
+        <w:rPr>
+          <w:sz w:val="19"/>
+          <w:szCs w:val="19"/>
+        </w:rPr>
+        <w:t xml:space="preserve">Sneakers &amp; clothing platform with brand news, trending products, and image sliders. </w:t>
+      </w:r>
+      <w:proofErr w:type="gramStart"/>
+      <w:r>
+        <w:rPr>
+          <w:sz w:val="19"/>
+          <w:szCs w:val="19"/>
+        </w:rPr>
+        <w:t>Full-stack</w:t>
+      </w:r>
+      <w:proofErr w:type="gramEnd"/>
+      <w:r>
+        <w:rPr>
+          <w:sz w:val="19"/>
+          <w:szCs w:val="19"/>
+        </w:rPr>
+        <w:t>: React, Node.js, MongoDB.</w:t>
+      </w:r>
     </w:p>
     <w:p>
       <w:pPr>
@@ -755,37 +935,80 @@
         <w:rPr>
           <w:b/>
           <w:bCs/>
+          <w:color w:val="156082" w:themeColor="accent1"/>
+        </w:rPr>
+        <w:t>•</w:t>
+      </w:r>
+      <w:r>
+        <w:rPr>
+          <w:b/>
+          <w:bCs/>
           <w:color w:val="0F7B6C"/>
         </w:rPr>
-        <w:t xml:space="preserve">• </w:t>
-      </w:r>
-      <w:r>
-        <w:rPr>
-          <w:b/>
-          <w:bCs/>
-          <w:sz w:val="19"/>
-          <w:szCs w:val="19"/>
-        </w:rPr>
-        <w:t xml:space="preserve">Aveksha — Digital Healthcare App — </w:t>
-      </w:r>
-      <w:r>
-        <w:rPr>
-          <w:sz w:val="19"/>
-          <w:szCs w:val="19"/>
-        </w:rPr>
-        <w:t xml:space="preserve">Flutter/Firebase mobile app for booking healthcare appointments and organising medical records. Node.js/MongoDB backend.  </w:t>
+        <w:t xml:space="preserve"> </w:t>
       </w:r>
       <w:hyperlink r:id="rId11" w:history="1">
+        <w:proofErr w:type="spellStart"/>
         <w:r>
           <w:rPr>
-            <w:color w:val="0F7B6C"/>
+            <w:rStyle w:val="Hyperlink"/>
+            <w:b/>
+            <w:bCs/>
+            <w:color w:val="215E99" w:themeColor="text2" w:themeTint="BF"/>
             <w:sz w:val="19"/>
             <w:szCs w:val="19"/>
-            <w:u w:val="single"/>
+            <w:u w:val="none"/>
           </w:rPr>
-          <w:t>↗</w:t>
+          <w:t>Aveksha</w:t>
+        </w:r>
+        <w:proofErr w:type="spellEnd"/>
+        <w:r>
+          <w:rPr>
+            <w:rStyle w:val="Hyperlink"/>
+            <w:b/>
+            <w:bCs/>
+            <w:color w:val="215E99" w:themeColor="text2" w:themeTint="BF"/>
+            <w:sz w:val="19"/>
+            <w:szCs w:val="19"/>
+            <w:u w:val="none"/>
+          </w:rPr>
+          <w:t xml:space="preserve"> (Digital Healthcare App)</w:t>
         </w:r>
       </w:hyperlink>
+      <w:r>
+        <w:rPr>
+          <w:rStyle w:val="Hyperlink"/>
+          <w:color w:val="215E99" w:themeColor="text2" w:themeTint="BF"/>
+          <w:u w:val="none"/>
+        </w:rPr>
+        <w:t xml:space="preserve"> </w:t>
+      </w:r>
+      <w:r>
+        <w:rPr>
+          <w:rStyle w:val="Hyperlink"/>
+          <w:b/>
+          <w:bCs/>
+          <w:color w:val="215E99" w:themeColor="text2" w:themeTint="BF"/>
+          <w:u w:val="none"/>
+        </w:rPr>
+        <w:t>:</w:t>
+      </w:r>
+      <w:r>
+        <w:rPr>
+          <w:b/>
+          <w:bCs/>
+          <w:sz w:val="19"/>
+          <w:szCs w:val="19"/>
+        </w:rPr>
+        <w:t xml:space="preserve"> </w:t>
+      </w:r>
+      <w:r>
+        <w:rPr>
+          <w:sz w:val="19"/>
+          <w:szCs w:val="19"/>
+        </w:rPr>
+        <w:t>Flutter/Firebase mobile app for booking healthcare appointments and organising medical records. Node.js/MongoDB backend.</w:t>
+      </w:r>
     </w:p>
     <w:p>
       <w:pPr>
@@ -795,37 +1018,80 @@
         <w:rPr>
           <w:b/>
           <w:bCs/>
+          <w:color w:val="156082" w:themeColor="accent1"/>
+        </w:rPr>
+        <w:t>•</w:t>
+      </w:r>
+      <w:r>
+        <w:rPr>
+          <w:b/>
+          <w:bCs/>
           <w:color w:val="0F7B6C"/>
         </w:rPr>
-        <w:t xml:space="preserve">• </w:t>
-      </w:r>
-      <w:r>
-        <w:rPr>
-          <w:b/>
-          <w:bCs/>
-          <w:sz w:val="19"/>
-          <w:szCs w:val="19"/>
-        </w:rPr>
-        <w:t xml:space="preserve">Insighter — Learning Management System — </w:t>
-      </w:r>
-      <w:r>
-        <w:rPr>
-          <w:sz w:val="19"/>
-          <w:szCs w:val="19"/>
-        </w:rPr>
-        <w:t xml:space="preserve">Gamified school LMS built with Flutter, Firebase, Node.js, and MongoDB.  </w:t>
+        <w:t xml:space="preserve"> </w:t>
       </w:r>
       <w:hyperlink r:id="rId12" w:history="1">
+        <w:proofErr w:type="spellStart"/>
         <w:r>
           <w:rPr>
-            <w:color w:val="0F7B6C"/>
+            <w:rStyle w:val="Hyperlink"/>
+            <w:b/>
+            <w:bCs/>
+            <w:color w:val="215E99" w:themeColor="text2" w:themeTint="BF"/>
             <w:sz w:val="19"/>
             <w:szCs w:val="19"/>
-            <w:u w:val="single"/>
+            <w:u w:val="none"/>
           </w:rPr>
-          <w:t>↗</w:t>
+          <w:t>Insighter</w:t>
+        </w:r>
+        <w:proofErr w:type="spellEnd"/>
+        <w:r>
+          <w:rPr>
+            <w:rStyle w:val="Hyperlink"/>
+            <w:b/>
+            <w:bCs/>
+            <w:color w:val="215E99" w:themeColor="text2" w:themeTint="BF"/>
+            <w:sz w:val="19"/>
+            <w:szCs w:val="19"/>
+            <w:u w:val="none"/>
+          </w:rPr>
+          <w:t xml:space="preserve"> (Learning Management System)</w:t>
         </w:r>
       </w:hyperlink>
+      <w:r>
+        <w:rPr>
+          <w:rStyle w:val="Hyperlink"/>
+          <w:color w:val="215E99" w:themeColor="text2" w:themeTint="BF"/>
+          <w:u w:val="none"/>
+        </w:rPr>
+        <w:t xml:space="preserve"> </w:t>
+      </w:r>
+      <w:r>
+        <w:rPr>
+          <w:rStyle w:val="Hyperlink"/>
+          <w:b/>
+          <w:bCs/>
+          <w:color w:val="215E99" w:themeColor="text2" w:themeTint="BF"/>
+          <w:u w:val="none"/>
+        </w:rPr>
+        <w:t>:</w:t>
+      </w:r>
+      <w:r>
+        <w:rPr>
+          <w:b/>
+          <w:bCs/>
+          <w:sz w:val="19"/>
+          <w:szCs w:val="19"/>
+        </w:rPr>
+        <w:t xml:space="preserve"> </w:t>
+      </w:r>
+      <w:r>
+        <w:rPr>
+          <w:sz w:val="19"/>
+          <w:szCs w:val="19"/>
+        </w:rPr>
+        <w:t>Gamified school LMS built with Flutter, Firebase, Node.js, and MongoDB.</w:t>
+      </w:r>
     </w:p>
     <w:p>
       <w:pPr>
@@ -835,37 +1101,66 @@
         <w:rPr>
           <w:b/>
           <w:bCs/>
+          <w:color w:val="156082" w:themeColor="accent1"/>
+        </w:rPr>
+        <w:t>•</w:t>
+      </w:r>
+      <w:r>
+        <w:rPr>
+          <w:b/>
+          <w:bCs/>
           <w:color w:val="0F7B6C"/>
         </w:rPr>
-        <w:t xml:space="preserve">• </w:t>
-      </w:r>
-      <w:r>
-        <w:rPr>
-          <w:b/>
-          <w:bCs/>
-          <w:sz w:val="19"/>
-          <w:szCs w:val="19"/>
-        </w:rPr>
-        <w:t xml:space="preserve">Pharma App — </w:t>
-      </w:r>
-      <w:r>
-        <w:rPr>
-          <w:sz w:val="19"/>
-          <w:szCs w:val="19"/>
-        </w:rPr>
-        <w:t xml:space="preserve">Web-based pharmacy inventory manager with stock tracking and medicine expiry monitoring (React, Node.js, MongoDB).  </w:t>
+        <w:t xml:space="preserve"> </w:t>
       </w:r>
       <w:hyperlink r:id="rId13" w:history="1">
         <w:r>
           <w:rPr>
-            <w:color w:val="0F7B6C"/>
+            <w:rStyle w:val="Hyperlink"/>
+            <w:b/>
+            <w:bCs/>
+            <w:color w:val="215E99" w:themeColor="text2" w:themeTint="BF"/>
             <w:sz w:val="19"/>
             <w:szCs w:val="19"/>
-            <w:u w:val="single"/>
+            <w:u w:val="none"/>
           </w:rPr>
-          <w:t>↗</w:t>
+          <w:t>Pharma App</w:t>
         </w:r>
       </w:hyperlink>
+      <w:r>
+        <w:rPr>
+          <w:rStyle w:val="Hyperlink"/>
+          <w:color w:val="215E99" w:themeColor="text2" w:themeTint="BF"/>
+          <w:u w:val="none"/>
+        </w:rPr>
+        <w:t xml:space="preserve"> </w:t>
+      </w:r>
+      <w:r>
+        <w:rPr>
+          <w:rStyle w:val="Hyperlink"/>
+          <w:b/>
+          <w:bCs/>
+          <w:color w:val="215E99" w:themeColor="text2" w:themeTint="BF"/>
+          <w:u w:val="none"/>
+        </w:rPr>
+        <w:t>:</w:t>
+      </w:r>
+      <w:r>
+        <w:rPr>
+          <w:b/>
+          <w:bCs/>
+          <w:sz w:val="19"/>
+          <w:szCs w:val="19"/>
+        </w:rPr>
+        <w:t xml:space="preserve"> </w:t>
+      </w:r>
+      <w:r>
+        <w:rPr>
+          <w:sz w:val="19"/>
+          <w:szCs w:val="19"/>
+        </w:rPr>
+        <w:t>Web-based pharmacy inventory manager with stock tracking and medicine expiry monitoring (React, Node.js, MongoDB).</w:t>
+      </w:r>
     </w:p>
     <w:p>
       <w:pPr>
@@ -879,7 +1174,7 @@
     <w:p>
       <w:pPr>
         <w:pBdr>
-          <w:bottom w:val="single" w:sz="8" w:space="1" w:color="3A7C22" w:themeColor="accent6" w:themeShade="BF"/>
+          <w:bottom w:val="single" w:sz="8" w:space="1" w:color="156082" w:themeColor="accent1"/>
         </w:pBdr>
         <w:spacing w:before="160" w:line="360" w:lineRule="auto"/>
         <w:rPr>
@@ -1045,7 +1340,23 @@
                 <w:sz w:val="19"/>
                 <w:szCs w:val="19"/>
               </w:rPr>
-              <w:t>Node.js · NestJS · Django · Express · Python · REST API</w:t>
+              <w:t xml:space="preserve">Node.js · </w:t>
+            </w:r>
+            <w:proofErr w:type="spellStart"/>
+            <w:r>
+              <w:rPr>
+                <w:sz w:val="19"/>
+                <w:szCs w:val="19"/>
+              </w:rPr>
+              <w:t>NestJS</w:t>
+            </w:r>
+            <w:proofErr w:type="spellEnd"/>
+            <w:r>
+              <w:rPr>
+                <w:sz w:val="19"/>
+                <w:szCs w:val="19"/>
+              </w:rPr>
+              <w:t xml:space="preserve"> · Express</w:t>
             </w:r>
           </w:p>
         </w:tc>
@@ -1080,6 +1391,16 @@
                 <w:szCs w:val="19"/>
               </w:rPr>
               <w:t>Databases</w:t>
+            </w:r>
+            <w:r>
+              <w:rPr>
+                <w:b/>
+                <w:bCs/>
+                <w:color w:val="1A2E4A"/>
+                <w:sz w:val="19"/>
+                <w:szCs w:val="19"/>
+              </w:rPr>
+              <w:t xml:space="preserve"> &amp; Tools</w:t>
             </w:r>
           </w:p>
         </w:tc>
@@ -1297,7 +1618,7 @@
                 <w:sz w:val="19"/>
                 <w:szCs w:val="19"/>
               </w:rPr>
-              <w:t>Docker · Git · Linux · CI/CD</w:t>
+              <w:t>Docker · Git · CI/CD</w:t>
             </w:r>
           </w:p>
         </w:tc>
@@ -1315,7 +1636,7 @@
     <w:p>
       <w:pPr>
         <w:pBdr>
-          <w:bottom w:val="single" w:sz="8" w:space="1" w:color="3A7C22" w:themeColor="accent6" w:themeShade="BF"/>
+          <w:bottom w:val="single" w:sz="8" w:space="1" w:color="156082" w:themeColor="accent1"/>
         </w:pBdr>
         <w:spacing w:before="160" w:line="360" w:lineRule="auto"/>
         <w:rPr>
@@ -1427,12 +1748,19 @@
     <w:p>
       <w:pPr>
         <w:spacing w:after="30"/>
-      </w:pPr>
-      <w:r>
         <w:rPr>
           <w:i/>
           <w:iCs/>
-          <w:color w:val="0F7B6C"/>
+          <w:color w:val="156082" w:themeColor="accent1"/>
+          <w:sz w:val="18"/>
+          <w:szCs w:val="18"/>
+        </w:rPr>
+      </w:pPr>
+      <w:r>
+        <w:rPr>
+          <w:i/>
+          <w:iCs/>
+          <w:color w:val="156082" w:themeColor="accent1"/>
           <w:sz w:val="18"/>
           <w:szCs w:val="18"/>
         </w:rPr>
@@ -1527,15 +1855,22 @@
     <w:p>
       <w:pPr>
         <w:spacing w:after="30"/>
-      </w:pPr>
-      <w:r>
         <w:rPr>
           <w:i/>
           <w:iCs/>
-          <w:color w:val="0F7B6C"/>
+          <w:color w:val="156082" w:themeColor="accent1"/>
           <w:sz w:val="18"/>
           <w:szCs w:val="18"/>
         </w:rPr>
+      </w:pPr>
+      <w:r>
+        <w:rPr>
+          <w:i/>
+          <w:iCs/>
+          <w:color w:val="156082" w:themeColor="accent1"/>
+          <w:sz w:val="18"/>
+          <w:szCs w:val="18"/>
+        </w:rPr>
         <w:t>Gandaki Boarding School · Pokhara  |  CGPA: 3.47 / 4.0</w:t>
       </w:r>
     </w:p>
@@ -1551,7 +1886,7 @@
     <w:p>
       <w:pPr>
         <w:pBdr>
-          <w:bottom w:val="single" w:sz="8" w:space="1" w:color="3A7C22" w:themeColor="accent6" w:themeShade="BF"/>
+          <w:bottom w:val="single" w:sz="8" w:space="1" w:color="156082" w:themeColor="accent1"/>
         </w:pBdr>
         <w:spacing w:before="160" w:line="360" w:lineRule="auto"/>
         <w:rPr>
@@ -1624,7 +1959,27 @@
           <w:sz w:val="19"/>
           <w:szCs w:val="19"/>
         </w:rPr>
-        <w:t>2nd Place — KUHackfest 2022</w:t>
+        <w:t xml:space="preserve">2nd Place — </w:t>
+      </w:r>
+      <w:proofErr w:type="spellStart"/>
+      <w:r>
+        <w:rPr>
+          <w:b/>
+          <w:bCs/>
+          <w:sz w:val="19"/>
+          <w:szCs w:val="19"/>
+        </w:rPr>
+        <w:t>KUHackfest</w:t>
+      </w:r>
+      <w:proofErr w:type="spellEnd"/>
+      <w:r>
+        <w:rPr>
+          <w:b/>
+          <w:bCs/>
+          <w:sz w:val="19"/>
+          <w:szCs w:val="19"/>
+        </w:rPr>
+        <w:t xml:space="preserve"> 2022</w:t>
       </w:r>
       <w:r>
         <w:rPr>
@@ -1676,22 +2031,22 @@
 </file>
 
 <file path=word/numbering.xml><?xml version="1.0" encoding="utf-8"?>
-<w:numbering xmlns:wpc="http://schemas.microsoft.com/office/word/2010/wordprocessingCanvas" xmlns:cx="http://schemas.microsoft.com/office/drawing/2014/chartex" xmlns:cx1="http://schemas.microsoft.com/office/drawing/2015/9/8/chartex" xmlns:cx2="http://schemas.microsoft.com/office/drawing/2015/10/21/chartex" xmlns:cx3="http://schemas.microsoft.com/office/drawing/2016/5/9/chartex" xmlns:cx4="http://schemas.microsoft.com/office/drawing/2016/5/10/chartex" xmlns:cx5="http://schemas.microsoft.com/office/drawing/2016/5/11/chartex" xmlns:cx6="http://schemas.microsoft.com/office/drawing/2016/5/12/chartex" xmlns:cx7="http://schemas.microsoft.com/office/drawing/2016/5/13/chartex" xmlns:cx8="http://schemas.microsoft.com/office/drawing/2016/5/14/chartex" xmlns:mc="http://schemas.openxmlformats.org/markup-compatibility/2006" xmlns:aink="http://schemas.microsoft.com/office/drawing/2016/ink" xmlns:am3d="http://schemas.microsoft.com/office/drawing/2017/model3d" xmlns:o="urn:schemas-microsoft-com:office:office" xmlns:oel="http://schemas.microsoft.com/office/2019/extlst" xmlns:r="http://schemas.openxmlformats.org/officeDocument/2006/relationships" xmlns:m="http://schemas.openxmlformats.org/officeDocument/2006/math" xmlns:v="urn:schemas-microsoft-com:vml" xmlns:wp14="http://schemas.microsoft.com/office/word/2010/wordprocessingDrawing" xmlns:wp="http://schemas.openxmlformats.org/drawingml/2006/wordprocessingDrawing" xmlns:w10="urn:schemas-microsoft-com:office:word" xmlns:w="http://schemas.openxmlformats.org/wordprocessingml/2006/main" xmlns:w14="http://schemas.microsoft.com/office/word/2010/wordml" xmlns:w15="http://schemas.microsoft.com/office/word/2012/wordml" xmlns:w16cex="http://schemas.microsoft.com/office/word/2018/wordml/cex" xmlns:w16cid="http://schemas.microsoft.com/office/word/2016/wordml/cid" xmlns:w16="http://schemas.microsoft.com/office/word/2018/wordml" xmlns:w16du="http://schemas.microsoft.com/office/word/2023/wordml/word16du" xmlns:w16sdtdh="http://schemas.microsoft.com/office/word/2020/wordml/sdtdatahash" xmlns:w16sdtfl="http://schemas.microsoft.com/office/word/2024/wordml/sdtformatlock" xmlns:w16se="http://schemas.microsoft.com/office/word/2015/wordml/symex" xmlns:wpg="http://schemas.microsoft.com/office/word/2010/wordprocessingGroup" xmlns:wpi="http://schemas.microsoft.com/office/word/2010/wordprocessingInk" xmlns:wne="http://schemas.microsoft.com/office/word/2006/wordml" xmlns:wps="http://schemas.microsoft.com/office/word/2010/wordprocessingShape" mc:Ignorable="w14 w15 w16se w16cid w16 w16cex w16sdtdh w16sdtfl w16du wp14">
+<w:numbering xmlns:wpc="http://schemas.microsoft.com/office/word/2010/wordprocessingCanvas" xmlns:cx="http://schemas.microsoft.com/office/drawing/2014/chartex" xmlns:cx1="http://schemas.microsoft.com/office/drawing/2015/9/8/chartex" xmlns:cx2="http://schemas.microsoft.com/office/drawing/2015/10/21/chartex" xmlns:cx3="http://schemas.microsoft.com/office/drawing/2016/5/9/chartex" xmlns:cx4="http://schemas.microsoft.com/office/drawing/2016/5/10/chartex" xmlns:cx5="http://schemas.microsoft.com/office/drawing/2016/5/11/chartex" xmlns:cx6="http://schemas.microsoft.com/office/drawing/2016/5/12/chartex" xmlns:cx7="http://schemas.microsoft.com/office/drawing/2016/5/13/chartex" xmlns:cx8="http://schemas.microsoft.com/office/drawing/2016/5/14/chartex" xmlns:mc="http://schemas.openxmlformats.org/markup-compatibility/2006" xmlns:aink="http://schemas.microsoft.com/office/drawing/2016/ink" xmlns:am3d="http://schemas.microsoft.com/office/drawing/2017/model3d" xmlns:o="urn:schemas-microsoft-com:office:office" xmlns:oel="http://schemas.microsoft.com/office/2019/extlst" xmlns:r="http://schemas.openxmlformats.org/officeDocument/2006/relationships" xmlns:m="http://schemas.openxmlformats.org/officeDocument/2006/math" xmlns:v="urn:schemas-microsoft-com:vml" xmlns:wp14="http://schemas.microsoft.com/office/word/2010/wordprocessingDrawing" xmlns:wp="http://schemas.openxmlformats.org/drawingml/2006/wordprocessingDrawing" xmlns:w10="urn:schemas-microsoft-com:office:word" xmlns:w="http://schemas.openxmlformats.org/wordprocessingml/2006/main" xmlns:w14="http://schemas.microsoft.com/office/word/2010/wordml" xmlns:w15="http://schemas.microsoft.com/office/word/2012/wordml" xmlns:w16cei="http://schemas.microsoft.com/office/word/2026/wordml/cei" xmlns:w16cex="http://schemas.microsoft.com/office/word/2018/wordml/cex" xmlns:w16cid="http://schemas.microsoft.com/office/word/2016/wordml/cid" xmlns:w16="http://schemas.microsoft.com/office/word/2018/wordml" xmlns:w16du="http://schemas.microsoft.com/office/word/2023/wordml/word16du" xmlns:w16sdtdh="http://schemas.microsoft.com/office/word/2020/wordml/sdtdatahash" xmlns:w16sdtfl="http://schemas.microsoft.com/office/word/2024/wordml/sdtformatlock" xmlns:w16se="http://schemas.microsoft.com/office/word/2015/wordml/symex" xmlns:wpg="http://schemas.microsoft.com/office/word/2010/wordprocessingGroup" xmlns:wpi="http://schemas.microsoft.com/office/word/2010/wordprocessingInk" xmlns:wne="http://schemas.microsoft.com/office/word/2006/wordml" xmlns:wps="http://schemas.microsoft.com/office/word/2010/wordprocessingShape" mc:Ignorable="w14 w15 w16se w16cid w16 w16cex w16sdtdh w16sdtfl w16du wp14">
   <w:abstractNum w:abstractNumId="0" w15:restartNumberingAfterBreak="0">
     <w:nsid w:val="07D77C75"/>
     <w:multiLevelType w:val="hybridMultilevel"/>
-    <w:tmpl w:val="B9EAB784"/>
-    <w:lvl w:ilvl="0" w:tplc="E50EDD62">
+    <w:tmpl w:val="67A48464"/>
+    <w:lvl w:ilvl="0" w:tplc="7E26E266">
       <w:start w:val="1"/>
       <w:numFmt w:val="bullet"/>
-      <w:lvlText w:val="–"/>
+      <w:lvlText w:val=""/>
       <w:lvlJc w:val="left"/>
       <w:pPr>
         <w:ind w:left="360" w:hanging="180"/>
       </w:pPr>
       <w:rPr>
-        <w:rFonts w:ascii="Arial" w:eastAsia="Arial" w:hAnsi="Arial" w:cs="Arial"/>
-        <w:color w:val="0F7B6C"/>
+        <w:rFonts w:ascii="Wingdings" w:hAnsi="Wingdings" w:hint="default"/>
+        <w:color w:val="156082" w:themeColor="accent1"/>
         <w:sz w:val="19"/>
         <w:szCs w:val="19"/>
       </w:rPr>
@@ -1831,9 +2186,9 @@
   </w:num>
   <w:num w:numId="2" w16cid:durableId="2032100000">
     <w:abstractNumId w:val="0"/>
-    <w:lvlOverride w:ilvl="0">
-      <w:startOverride w:val="1"/>
-    </w:lvlOverride>
+  </w:num>
+  <w:num w:numId="3" w16cid:durableId="168757998">
+    <w:abstractNumId w:val="0"/>
   </w:num>
 </w:numbering>
 </file>

</xml_diff>